<commit_message>
P11 - lima modul berjalan
</commit_message>
<xml_diff>
--- a/worksheet-p11/25523236-Diah Putri Pertiwi.docx
+++ b/worksheet-p11/25523236-Diah Putri Pertiwi.docx
@@ -27,7 +27,6 @@
           <w:p>
             <w:pPr>
               <w:spacing w:before="20" w:after="20"/>
-              <w:jc w:val="center"/>
             </w:pPr>
             <w:r>
               <w:rPr>
@@ -4142,6 +4141,43 @@
       <w:pPr>
         <w:spacing w:after="60"/>
       </w:pPr>
+      <w:r>
+        <w:drawing>
+          <wp:inline distT="0" distB="0" distL="0" distR="0" wp14:anchorId="1ED76FD9" wp14:editId="2600DD67">
+            <wp:extent cx="2779414" cy="3063269"/>
+            <wp:effectExtent l="0" t="0" r="1905" b="3810"/>
+            <wp:docPr id="1122736970" name="Picture 1"/>
+            <wp:cNvGraphicFramePr>
+              <a:graphicFrameLocks xmlns:a="http://schemas.openxmlformats.org/drawingml/2006/main" noChangeAspect="1"/>
+            </wp:cNvGraphicFramePr>
+            <a:graphic xmlns:a="http://schemas.openxmlformats.org/drawingml/2006/main">
+              <a:graphicData uri="http://schemas.openxmlformats.org/drawingml/2006/picture">
+                <pic:pic xmlns:pic="http://schemas.openxmlformats.org/drawingml/2006/picture">
+                  <pic:nvPicPr>
+                    <pic:cNvPr id="1122736970" name=""/>
+                    <pic:cNvPicPr/>
+                  </pic:nvPicPr>
+                  <pic:blipFill>
+                    <a:blip r:embed="rId10"/>
+                    <a:stretch>
+                      <a:fillRect/>
+                    </a:stretch>
+                  </pic:blipFill>
+                  <pic:spPr>
+                    <a:xfrm>
+                      <a:off x="0" y="0"/>
+                      <a:ext cx="2782623" cy="3066806"/>
+                    </a:xfrm>
+                    <a:prstGeom prst="rect">
+                      <a:avLst/>
+                    </a:prstGeom>
+                  </pic:spPr>
+                </pic:pic>
+              </a:graphicData>
+            </a:graphic>
+          </wp:inline>
+        </w:drawing>
+      </w:r>
     </w:p>
     <w:p>
       <w:pPr>
@@ -5768,6 +5804,9 @@
             <w:pPr>
               <w:spacing w:before="20" w:after="20" w:line="252" w:lineRule="auto"/>
             </w:pPr>
+            <w:r>
+              <w:t>Bersih, tidak ada galat impor maupun pesan merah/kuning.</w:t>
+            </w:r>
           </w:p>
         </w:tc>
       </w:tr>
@@ -5837,6 +5876,9 @@
             <w:pPr>
               <w:spacing w:before="20" w:after="20" w:line="252" w:lineRule="auto"/>
             </w:pPr>
+            <w:r>
+              <w:t>Sama persis seperti akhir Pertemuan 9 (filter kategori &amp; form berjalan).</w:t>
+            </w:r>
           </w:p>
         </w:tc>
       </w:tr>
@@ -5906,6 +5948,9 @@
             <w:pPr>
               <w:spacing w:before="20" w:after="20" w:line="252" w:lineRule="auto"/>
             </w:pPr>
+            <w:r>
+              <w:t>Hanya berisi baris import modul dan pemanggilan fungsi awal.</w:t>
+            </w:r>
           </w:p>
         </w:tc>
       </w:tr>
@@ -5975,6 +6020,9 @@
             <w:pPr>
               <w:spacing w:before="20" w:after="20" w:line="252" w:lineRule="auto"/>
             </w:pPr>
+            <w:r>
+              <w:t>5 berkas modul wajib (data.js, state.js, dom.js, events.js, app.js) + api.js dari P10.</w:t>
+            </w:r>
           </w:p>
         </w:tc>
       </w:tr>
@@ -6044,10 +6092,192 @@
             <w:pPr>
               <w:spacing w:before="20" w:after="20" w:line="252" w:lineRule="auto"/>
             </w:pPr>
+            <w:r>
+              <w:t>Semua jalur import sudah berawalan ./ dan berakhiran .js.</w:t>
+            </w:r>
           </w:p>
         </w:tc>
       </w:tr>
     </w:tbl>
+    <w:p>
+      <w:pPr>
+        <w:spacing w:after="60"/>
+      </w:pPr>
+    </w:p>
+    <w:p>
+      <w:pPr>
+        <w:spacing w:after="60"/>
+      </w:pPr>
+      <w:r>
+        <w:drawing>
+          <wp:inline distT="0" distB="0" distL="0" distR="0" wp14:anchorId="784672FE" wp14:editId="0078273C">
+            <wp:extent cx="2729132" cy="664452"/>
+            <wp:effectExtent l="0" t="0" r="0" b="2540"/>
+            <wp:docPr id="884172161" name="Picture 1"/>
+            <wp:cNvGraphicFramePr>
+              <a:graphicFrameLocks xmlns:a="http://schemas.openxmlformats.org/drawingml/2006/main" noChangeAspect="1"/>
+            </wp:cNvGraphicFramePr>
+            <a:graphic xmlns:a="http://schemas.openxmlformats.org/drawingml/2006/main">
+              <a:graphicData uri="http://schemas.openxmlformats.org/drawingml/2006/picture">
+                <pic:pic xmlns:pic="http://schemas.openxmlformats.org/drawingml/2006/picture">
+                  <pic:nvPicPr>
+                    <pic:cNvPr id="884172161" name=""/>
+                    <pic:cNvPicPr/>
+                  </pic:nvPicPr>
+                  <pic:blipFill>
+                    <a:blip r:embed="rId11"/>
+                    <a:stretch>
+                      <a:fillRect/>
+                    </a:stretch>
+                  </pic:blipFill>
+                  <pic:spPr>
+                    <a:xfrm>
+                      <a:off x="0" y="0"/>
+                      <a:ext cx="2740597" cy="667243"/>
+                    </a:xfrm>
+                    <a:prstGeom prst="rect">
+                      <a:avLst/>
+                    </a:prstGeom>
+                  </pic:spPr>
+                </pic:pic>
+              </a:graphicData>
+            </a:graphic>
+          </wp:inline>
+        </w:drawing>
+      </w:r>
+    </w:p>
+    <w:p>
+      <w:pPr>
+        <w:spacing w:after="60"/>
+      </w:pPr>
+    </w:p>
+    <w:p>
+      <w:pPr>
+        <w:spacing w:after="60"/>
+      </w:pPr>
+      <w:r>
+        <w:lastRenderedPageBreak/>
+        <w:drawing>
+          <wp:inline distT="0" distB="0" distL="0" distR="0" wp14:anchorId="4DC3FEBD" wp14:editId="50D52EAC">
+            <wp:extent cx="2374118" cy="2131656"/>
+            <wp:effectExtent l="0" t="0" r="7620" b="2540"/>
+            <wp:docPr id="1481209481" name="Picture 1"/>
+            <wp:cNvGraphicFramePr>
+              <a:graphicFrameLocks xmlns:a="http://schemas.openxmlformats.org/drawingml/2006/main" noChangeAspect="1"/>
+            </wp:cNvGraphicFramePr>
+            <a:graphic xmlns:a="http://schemas.openxmlformats.org/drawingml/2006/main">
+              <a:graphicData uri="http://schemas.openxmlformats.org/drawingml/2006/picture">
+                <pic:pic xmlns:pic="http://schemas.openxmlformats.org/drawingml/2006/picture">
+                  <pic:nvPicPr>
+                    <pic:cNvPr id="1481209481" name=""/>
+                    <pic:cNvPicPr/>
+                  </pic:nvPicPr>
+                  <pic:blipFill>
+                    <a:blip r:embed="rId12"/>
+                    <a:stretch>
+                      <a:fillRect/>
+                    </a:stretch>
+                  </pic:blipFill>
+                  <pic:spPr>
+                    <a:xfrm>
+                      <a:off x="0" y="0"/>
+                      <a:ext cx="2388744" cy="2144789"/>
+                    </a:xfrm>
+                    <a:prstGeom prst="rect">
+                      <a:avLst/>
+                    </a:prstGeom>
+                  </pic:spPr>
+                </pic:pic>
+              </a:graphicData>
+            </a:graphic>
+          </wp:inline>
+        </w:drawing>
+      </w:r>
+    </w:p>
+    <w:p>
+      <w:pPr>
+        <w:spacing w:after="60"/>
+      </w:pPr>
+      <w:r>
+        <w:drawing>
+          <wp:inline distT="0" distB="0" distL="0" distR="0" wp14:anchorId="3EA3296E" wp14:editId="629521BF">
+            <wp:extent cx="2356339" cy="761968"/>
+            <wp:effectExtent l="0" t="0" r="6350" b="635"/>
+            <wp:docPr id="418385558" name="Picture 1"/>
+            <wp:cNvGraphicFramePr>
+              <a:graphicFrameLocks xmlns:a="http://schemas.openxmlformats.org/drawingml/2006/main" noChangeAspect="1"/>
+            </wp:cNvGraphicFramePr>
+            <a:graphic xmlns:a="http://schemas.openxmlformats.org/drawingml/2006/main">
+              <a:graphicData uri="http://schemas.openxmlformats.org/drawingml/2006/picture">
+                <pic:pic xmlns:pic="http://schemas.openxmlformats.org/drawingml/2006/picture">
+                  <pic:nvPicPr>
+                    <pic:cNvPr id="418385558" name=""/>
+                    <pic:cNvPicPr/>
+                  </pic:nvPicPr>
+                  <pic:blipFill>
+                    <a:blip r:embed="rId13"/>
+                    <a:stretch>
+                      <a:fillRect/>
+                    </a:stretch>
+                  </pic:blipFill>
+                  <pic:spPr>
+                    <a:xfrm>
+                      <a:off x="0" y="0"/>
+                      <a:ext cx="2364865" cy="764725"/>
+                    </a:xfrm>
+                    <a:prstGeom prst="rect">
+                      <a:avLst/>
+                    </a:prstGeom>
+                  </pic:spPr>
+                </pic:pic>
+              </a:graphicData>
+            </a:graphic>
+          </wp:inline>
+        </w:drawing>
+      </w:r>
+    </w:p>
+    <w:p>
+      <w:pPr>
+        <w:spacing w:after="60"/>
+      </w:pPr>
+      <w:r>
+        <w:drawing>
+          <wp:inline distT="0" distB="0" distL="0" distR="0" wp14:anchorId="6FEF0BDB" wp14:editId="40A6D0C3">
+            <wp:extent cx="1320868" cy="1511378"/>
+            <wp:effectExtent l="0" t="0" r="0" b="0"/>
+            <wp:docPr id="1624818284" name="Picture 1"/>
+            <wp:cNvGraphicFramePr>
+              <a:graphicFrameLocks xmlns:a="http://schemas.openxmlformats.org/drawingml/2006/main" noChangeAspect="1"/>
+            </wp:cNvGraphicFramePr>
+            <a:graphic xmlns:a="http://schemas.openxmlformats.org/drawingml/2006/main">
+              <a:graphicData uri="http://schemas.openxmlformats.org/drawingml/2006/picture">
+                <pic:pic xmlns:pic="http://schemas.openxmlformats.org/drawingml/2006/picture">
+                  <pic:nvPicPr>
+                    <pic:cNvPr id="1624818284" name=""/>
+                    <pic:cNvPicPr/>
+                  </pic:nvPicPr>
+                  <pic:blipFill>
+                    <a:blip r:embed="rId14"/>
+                    <a:stretch>
+                      <a:fillRect/>
+                    </a:stretch>
+                  </pic:blipFill>
+                  <pic:spPr>
+                    <a:xfrm>
+                      <a:off x="0" y="0"/>
+                      <a:ext cx="1320868" cy="1511378"/>
+                    </a:xfrm>
+                    <a:prstGeom prst="rect">
+                      <a:avLst/>
+                    </a:prstGeom>
+                  </pic:spPr>
+                </pic:pic>
+              </a:graphicData>
+            </a:graphic>
+          </wp:inline>
+        </w:drawing>
+      </w:r>
+    </w:p>
     <w:p>
       <w:pPr>
         <w:spacing w:after="60"/>
@@ -6170,7 +6400,6 @@
                 <w:color w:val="E2E8F0"/>
                 <w:sz w:val="17"/>
               </w:rPr>
-              <w:lastRenderedPageBreak/>
               <w:t>git add .</w:t>
             </w:r>
             <w:r>
@@ -6266,6 +6495,43 @@
       <w:pPr>
         <w:spacing w:after="60"/>
       </w:pPr>
+      <w:r>
+        <w:drawing>
+          <wp:inline distT="0" distB="0" distL="0" distR="0" wp14:anchorId="78954065" wp14:editId="10D44E11">
+            <wp:extent cx="2729132" cy="664452"/>
+            <wp:effectExtent l="0" t="0" r="0" b="2540"/>
+            <wp:docPr id="1099315729" name="Picture 1"/>
+            <wp:cNvGraphicFramePr>
+              <a:graphicFrameLocks xmlns:a="http://schemas.openxmlformats.org/drawingml/2006/main" noChangeAspect="1"/>
+            </wp:cNvGraphicFramePr>
+            <a:graphic xmlns:a="http://schemas.openxmlformats.org/drawingml/2006/main">
+              <a:graphicData uri="http://schemas.openxmlformats.org/drawingml/2006/picture">
+                <pic:pic xmlns:pic="http://schemas.openxmlformats.org/drawingml/2006/picture">
+                  <pic:nvPicPr>
+                    <pic:cNvPr id="884172161" name=""/>
+                    <pic:cNvPicPr/>
+                  </pic:nvPicPr>
+                  <pic:blipFill>
+                    <a:blip r:embed="rId11"/>
+                    <a:stretch>
+                      <a:fillRect/>
+                    </a:stretch>
+                  </pic:blipFill>
+                  <pic:spPr>
+                    <a:xfrm>
+                      <a:off x="0" y="0"/>
+                      <a:ext cx="2740597" cy="667243"/>
+                    </a:xfrm>
+                    <a:prstGeom prst="rect">
+                      <a:avLst/>
+                    </a:prstGeom>
+                  </pic:spPr>
+                </pic:pic>
+              </a:graphicData>
+            </a:graphic>
+          </wp:inline>
+        </w:drawing>
+      </w:r>
     </w:p>
     <w:p>
       <w:pPr>
@@ -12167,7 +12433,6 @@
                 <w:color w:val="003796"/>
                 <w:sz w:val="22"/>
               </w:rPr>
-              <w:lastRenderedPageBreak/>
               <w:t>☐  Pengubah  setiap perubahan keadaan ditulis sebagai fungsi bernama di state.js, dan fungsi itulah yang memanggil render</w:t>
             </w:r>
           </w:p>
@@ -17303,7 +17568,7 @@
       </w:pPr>
     </w:p>
     <w:sectPr>
-      <w:footerReference w:type="default" r:id="rId10"/>
+      <w:footerReference w:type="default" r:id="rId15"/>
       <w:pgSz w:w="11906" w:h="16838"/>
       <w:pgMar w:top="964" w:right="1077" w:bottom="907" w:left="1077" w:header="720" w:footer="720" w:gutter="0"/>
       <w:cols w:space="720"/>
@@ -18217,7 +18482,6 @@
   <w:style w:type="character" w:default="1" w:styleId="DefaultParagraphFont">
     <w:name w:val="Default Paragraph Font"/>
     <w:uiPriority w:val="1"/>
-    <w:semiHidden/>
     <w:unhideWhenUsed/>
   </w:style>
   <w:style w:type="table" w:default="1" w:styleId="TableNormal">

</xml_diff>